<commit_message>
Update College of Business PTL Annual Evaluation Form.docx
</commit_message>
<xml_diff>
--- a/College of Business PTL Annual Evaluation Form.docx
+++ b/College of Business PTL Annual Evaluation Form.docx
@@ -122,7 +122,29 @@
           <w:szCs w:val="26"/>
           <w14:ligatures w14:val="none"/>
         </w:rPr>
-        <w:t>_________________________________</w:t>
+        <w:t>________________</w:t>
+      </w:r>
+      <w:proofErr w:type="spellStart"/>
+      <w:r>
+        <w:rPr>
+          <w:rFonts w:ascii="Times New Roman" w:eastAsia="Times New Roman" w:hAnsi="Times New Roman" w:cs="Times New Roman"/>
+          <w:kern w:val="0"/>
+          <w:sz w:val="26"/>
+          <w:szCs w:val="26"/>
+          <w14:ligatures w14:val="none"/>
+        </w:rPr>
+        <w:t>jgfgifjoigfjfjjlfkl</w:t>
+      </w:r>
+      <w:proofErr w:type="spellEnd"/>
+      <w:r>
+        <w:rPr>
+          <w:rFonts w:ascii="Times New Roman" w:eastAsia="Times New Roman" w:hAnsi="Times New Roman" w:cs="Times New Roman"/>
+          <w:kern w:val="0"/>
+          <w:sz w:val="26"/>
+          <w:szCs w:val="26"/>
+          <w14:ligatures w14:val="none"/>
+        </w:rPr>
+        <w:t>_________________</w:t>
       </w:r>
     </w:p>
     <w:p>

</xml_diff>